<commit_message>
Add enterprise schema and workflow QA foundation
</commit_message>
<xml_diff>
--- a/word_templates/5. TS Mau DCCTHP 2026-up.docx
+++ b/word_templates/5. TS Mau DCCTHP 2026-up.docx
@@ -268,61 +268,28 @@
       <w:pPr>
         <w:jc w:val="center"/>
         <w:rPr>
-          <w:bCs/>
-        </w:rPr>
-      </w:pPr>
-      <w:r>
-        <w:rPr>
-          <w:bCs/>
+          <w:b/>
+        </w:rPr>
+      </w:pPr>
+      <w:r>
+        <w:rPr>
+          <w:b/>
           <w:lang w:val="vi-VN"/>
         </w:rPr>
-        <w:t xml:space="preserve">{{ </w:t>
-      </w:r>
-      <w:r>
-        <w:rPr>
-          <w:bCs/>
-        </w:rPr>
-        <w:t>C</w:t>
-      </w:r>
-      <w:r>
-        <w:rPr>
-          <w:bCs/>
+        <w:t>{{ CourseName</w:t>
+      </w:r>
+      <w:r>
+        <w:rPr>
+          <w:b/>
+        </w:rPr>
+        <w:t xml:space="preserve"> | upper</w:t>
+      </w:r>
+      <w:r>
+        <w:rPr>
+          <w:b/>
           <w:lang w:val="vi-VN"/>
         </w:rPr>
-        <w:t>ourse</w:t>
-      </w:r>
-      <w:r>
-        <w:rPr>
-          <w:bCs/>
-        </w:rPr>
-        <w:t>N</w:t>
-      </w:r>
-      <w:r>
-        <w:rPr>
-          <w:bCs/>
-          <w:lang w:val="vi-VN"/>
-        </w:rPr>
-        <w:t>ame</w:t>
-      </w:r>
-      <w:r>
-        <w:rPr>
-          <w:bCs/>
-          <w:lang w:val="vi-VN"/>
-        </w:rPr>
-        <w:t xml:space="preserve"> </w:t>
-      </w:r>
-      <w:r>
-        <w:rPr>
-          <w:bCs/>
-        </w:rPr>
-        <w:t xml:space="preserve">| upper </w:t>
-      </w:r>
-      <w:r>
-        <w:rPr>
-          <w:bCs/>
-          <w:lang w:val="vi-VN"/>
-        </w:rPr>
-        <w:t>}}</w:t>
+        <w:t xml:space="preserve"> }}</w:t>
       </w:r>
     </w:p>
     <w:p>
@@ -388,41 +355,19 @@
         <w:rPr>
           <w:lang w:val="vi-VN"/>
         </w:rPr>
-        <w:t xml:space="preserve">{{ </w:t>
-      </w:r>
-      <w:r>
-        <w:t>C</w:t>
-      </w:r>
-      <w:r>
-        <w:rPr>
-          <w:lang w:val="vi-VN"/>
-        </w:rPr>
-        <w:t>ourse</w:t>
-      </w:r>
-      <w:r>
-        <w:t>N</w:t>
-      </w:r>
-      <w:r>
-        <w:rPr>
-          <w:lang w:val="vi-VN"/>
-        </w:rPr>
-        <w:t>ame</w:t>
-      </w:r>
-      <w:r>
-        <w:t xml:space="preserve"> | upper</w:t>
-      </w:r>
-      <w:r>
-        <w:rPr>
-          <w:lang w:val="vi-VN"/>
-        </w:rPr>
-        <w:t xml:space="preserve"> }}</w:t>
+        <w:t>{{ CourseName | upper }}</w:t>
       </w:r>
     </w:p>
     <w:p>
-      <w:r>
+      <w:pPr>
         <w:rPr>
           <w:lang w:val="vi-VN"/>
         </w:rPr>
+      </w:pPr>
+      <w:r>
+        <w:rPr>
+          <w:lang w:val="vi-VN"/>
+        </w:rPr>
         <w:t>T</w:t>
       </w:r>
       <w:r>
@@ -445,30 +390,33 @@
       </w:r>
       <w:r>
         <w:rPr>
-          <w:iCs/>
-        </w:rPr>
-        <w:t>{{ CourseNameEN</w:t>
-      </w:r>
-      <w:r>
-        <w:rPr>
-          <w:iCs/>
-        </w:rPr>
-        <w:t xml:space="preserve"> | upper</w:t>
-      </w:r>
-      <w:r>
-        <w:rPr>
-          <w:iCs/>
-        </w:rPr>
-        <w:t xml:space="preserve"> }}</w:t>
+          <w:lang w:val="vi-VN"/>
+        </w:rPr>
+        <w:t>{{ CourseName</w:t>
+      </w:r>
+      <w:r>
+        <w:t>EN</w:t>
+      </w:r>
+      <w:r>
+        <w:rPr>
+          <w:lang w:val="vi-VN"/>
+        </w:rPr>
+        <w:t xml:space="preserve"> | upper }}</w:t>
       </w:r>
     </w:p>
     <w:p>
+      <w:pPr>
+        <w:rPr>
+          <w:lang w:val="vi-VN"/>
+        </w:rPr>
+      </w:pPr>
       <w:r>
         <w:t xml:space="preserve">Tên đơn vị quản lý học phần: </w:t>
       </w:r>
       <w:r>
         <w:rPr>
           <w:iCs/>
+          <w:lang w:val="vi-VN"/>
         </w:rPr>
         <w:t>{{ Department }}</w:t>
       </w:r>
@@ -481,28 +429,6 @@
       </w:pPr>
       <w:r>
         <w:t xml:space="preserve">Các giảng viên phụ trách học phần: </w:t>
-      </w:r>
-      <w:r>
-        <w:rPr>
-          <w:i/>
-          <w:lang w:val="vi-VN"/>
-        </w:rPr>
-        <w:t>(</w:t>
-      </w:r>
-      <w:r>
-        <w:rPr>
-          <w:i/>
-        </w:rPr>
-        <w:t>Lấy dữ liệu theo bảng phân công chuyên môn xuất ra từ hệ thống quản lý giáo dục của trường, file gửi kèm;</w:t>
-      </w:r>
-      <w:r>
-        <w:t xml:space="preserve"> </w:t>
-      </w:r>
-      <w:r>
-        <w:rPr>
-          <w:i/>
-        </w:rPr>
-        <w:t>PGS/GS hoặc Tiến sĩ có công bố quốc tế phù hợp)</w:t>
       </w:r>
     </w:p>
     <w:tbl>
@@ -743,6 +669,15 @@
                 <w:lang w:val="nl-NL"/>
               </w:rPr>
             </w:pPr>
+            <w:r>
+              <w:rPr>
+                <w:rFonts w:eastAsia="TimesNewRoman"/>
+                <w:sz w:val="26"/>
+                <w:szCs w:val="26"/>
+                <w:lang w:val="nl-NL"/>
+              </w:rPr>
+              <w:t>{{ Lecturer }}</w:t>
+            </w:r>
           </w:p>
         </w:tc>
         <w:tc>
@@ -1174,21 +1109,21 @@
             </w:r>
             <w:r>
               <w:rPr>
-                <w:iCs/>
-              </w:rPr>
-              <w:t xml:space="preserve">{{ </w:t>
-            </w:r>
-            <w:r>
-              <w:rPr>
-                <w:iCs/>
-              </w:rPr>
-              <w:t>CourseCode</w:t>
-            </w:r>
-            <w:r>
-              <w:rPr>
-                <w:iCs/>
-              </w:rPr>
-              <w:t xml:space="preserve"> }}</w:t>
+                <w:lang w:val="vi-VN"/>
+              </w:rPr>
+              <w:t>(</w:t>
+            </w:r>
+            <w:r>
+              <w:rPr>
+                <w:lang w:val="fr-FR"/>
+              </w:rPr>
+              <w:t>mã học</w:t>
+            </w:r>
+            <w:r>
+              <w:rPr>
+                <w:lang w:val="vi-VN"/>
+              </w:rPr>
+              <w:t xml:space="preserve"> phần)</w:t>
             </w:r>
           </w:p>
         </w:tc>
@@ -1214,21 +1149,9 @@
             </w:r>
             <w:r>
               <w:rPr>
-                <w:iCs/>
-              </w:rPr>
-              <w:t xml:space="preserve">{{ </w:t>
-            </w:r>
-            <w:r>
-              <w:rPr>
-                <w:iCs/>
-              </w:rPr>
-              <w:t>Credits</w:t>
-            </w:r>
-            <w:r>
-              <w:rPr>
-                <w:iCs/>
-              </w:rPr>
-              <w:t xml:space="preserve"> }}</w:t>
+                <w:lang w:val="vi-VN"/>
+              </w:rPr>
+              <w:t>{{ Credits }}</w:t>
             </w:r>
           </w:p>
         </w:tc>
@@ -1271,22 +1194,7 @@
               </w:rPr>
             </w:pPr>
             <w:r>
-              <w:rPr>
-                <w:iCs/>
-              </w:rPr>
-              <w:t xml:space="preserve">{{ </w:t>
-            </w:r>
-            <w:r>
-              <w:rPr>
-                <w:iCs/>
-              </w:rPr>
-              <w:t>CourseType</w:t>
-            </w:r>
-            <w:r>
-              <w:rPr>
-                <w:iCs/>
-              </w:rPr>
-              <w:t xml:space="preserve"> }}</w:t>
+              <w:t>{{ CourseType }}</w:t>
             </w:r>
           </w:p>
         </w:tc>
@@ -1332,22 +1240,13 @@
               </w:rPr>
             </w:pPr>
             <w:r>
-              <w:rPr>
-                <w:iCs/>
-              </w:rPr>
-              <w:t xml:space="preserve">{{ </w:t>
-            </w:r>
-            <w:r>
-              <w:rPr>
-                <w:iCs/>
-              </w:rPr>
-              <w:t>CourseNature</w:t>
-            </w:r>
-            <w:r>
-              <w:rPr>
-                <w:iCs/>
-              </w:rPr>
-              <w:t xml:space="preserve"> }}</w:t>
+              <w:t>(</w:t>
+            </w:r>
+            <w:r>
+              <w:rPr>
+                <w:lang w:val="vi-VN"/>
+              </w:rPr>
+              <w:t>Lý thuyết; Hỗn hợp; Thực hành, thí nghiêm; Đồ án; Thực tập)</w:t>
             </w:r>
           </w:p>
         </w:tc>
@@ -2211,104 +2110,21 @@
     </w:p>
     <w:p>
       <w:pPr>
-        <w:jc w:val="both"/>
-        <w:rPr>
-          <w:i/>
-          <w:lang w:val="vi-VN"/>
-        </w:rPr>
-      </w:pPr>
-      <w:r>
-        <w:rPr>
-          <w:i/>
-          <w:lang w:val="vi-VN"/>
-        </w:rPr>
-        <w:t>(</w:t>
-      </w:r>
-      <w:r>
-        <w:rPr>
-          <w:i/>
-          <w:lang w:val="fr-FR"/>
-        </w:rPr>
-        <w:t>Nêu ngắn gọn cô đọng về vai trò của học phần trong mục tiêu CTĐT, đóng góp của học phần trong quá trình hình thành năng lực của người học sau khi tốt nghiệp</w:t>
-      </w:r>
-      <w:r>
-        <w:rPr>
-          <w:i/>
-          <w:lang w:val="vi-VN"/>
-        </w:rPr>
-        <w:t>)</w:t>
-      </w:r>
-    </w:p>
-    <w:p>
-      <w:pPr>
-        <w:jc w:val="both"/>
-        <w:rPr>
-          <w:i/>
-        </w:rPr>
-      </w:pPr>
-      <w:r>
-        <w:rPr>
-          <w:i/>
-          <w:lang w:val="vi-VN"/>
-        </w:rPr>
-        <w:t>Học phần tập trung vào các nội dung chuyên sâu về [</w:t>
-      </w:r>
-      <w:r>
-        <w:rPr>
-          <w:i/>
-          <w:color w:val="FF0000"/>
-          <w:lang w:val="vi-VN"/>
-        </w:rPr>
-        <w:t>tên lĩnh vực</w:t>
-      </w:r>
-      <w:r>
-        <w:rPr>
-          <w:i/>
-          <w:lang w:val="vi-VN"/>
-        </w:rPr>
-        <w:t xml:space="preserve">]. Khác với bậc đào tạo dưới, học phần này nhấn mạnh vào việc phân tích các học thuyết hiện đại và phương pháp luận nghiên cứu bậc cao. Nội dung học phần được thiết kế để hỗ trợ trực tiếp cho việc hình thành </w:t>
-      </w:r>
-      <w:r>
-        <w:rPr>
-          <w:i/>
-          <w:lang w:val="vi-VN"/>
-        </w:rPr>
-        <w:lastRenderedPageBreak/>
-        <w:t>khung lý thuyết và đóng góp trọng yếu vào việc thiết kế mô hình nghiên cứu cho luận án và bài báo quốc tế của NCS</w:t>
-      </w:r>
-      <w:r>
-        <w:rPr>
-          <w:i/>
-        </w:rPr>
-        <w:t>.</w:t>
-      </w:r>
-    </w:p>
-    <w:p>
-      <w:pPr>
-        <w:jc w:val="both"/>
-        <w:rPr>
-          <w:i/>
-        </w:rPr>
-      </w:pPr>
-      <w:r>
-        <w:rPr>
-          <w:i/>
-        </w:rPr>
-        <w:t>Tiểu luận tổng quan: yêu cầu NCS thực hiện một công trình tổng thuật khoa học chuyên sâu, tập trung vào việc xác định và lựa chọn lĩnh vực, đề tài nghiên cứu. NCS phải phân tích, đánh giá các công trình nghiên cứu trong và ngoài nước liên quan trực tiếp đến đề tài, từ đó chỉ ra các khoảng trống tri thức và xác định mục đích, nhiệm vụ nghiên cứu cho luận án.</w:t>
-      </w:r>
-    </w:p>
-    <w:p>
-      <w:pPr>
-        <w:jc w:val="both"/>
-        <w:rPr>
-          <w:lang w:val="vi-VN"/>
-        </w:rPr>
-      </w:pPr>
-      <w:r>
-        <w:rPr>
-          <w:i/>
-        </w:rPr>
-        <w:t>Chuyên đề Tiến sĩ: cung cấp kiến thức chuyên sâu về một hướng nghiên cứu cụ thể thuộc lĩnh vực luận án. Nội dung học phần tập trung vào việc cập nhật các thành tựu khoa học mới nhất, các phương pháp tiếp cận tiên tiến và kết quả thực nghiệm liên quan đến đề tài. NCS sẽ tập trung nghiên cứu các giải pháp, mô hình hoặc thuật toán để giải quyết một phần quan trọng của vấn đề nghiên cứu.</w:t>
+        <w:rPr>
+          <w:rFonts w:ascii="Arial" w:hAnsi="Arial" w:cs="Arial"/>
+          <w:color w:val="000000"/>
+          <w:sz w:val="22"/>
+          <w:szCs w:val="22"/>
+        </w:rPr>
+      </w:pPr>
+      <w:r>
+        <w:rPr>
+          <w:rFonts w:ascii="Arial" w:hAnsi="Arial" w:cs="Arial"/>
+          <w:color w:val="000000"/>
+          <w:sz w:val="22"/>
+          <w:szCs w:val="22"/>
+        </w:rPr>
+        <w:t>{{ Summary }}</w:t>
       </w:r>
     </w:p>
     <w:p>
@@ -2392,9 +2208,9 @@
         <w:tblLook w:val="0000" w:firstRow="0" w:lastRow="0" w:firstColumn="0" w:lastColumn="0" w:noHBand="0" w:noVBand="0"/>
       </w:tblPr>
       <w:tblGrid>
-        <w:gridCol w:w="1126"/>
-        <w:gridCol w:w="6600"/>
-        <w:gridCol w:w="1348"/>
+        <w:gridCol w:w="1644"/>
+        <w:gridCol w:w="6341"/>
+        <w:gridCol w:w="1089"/>
       </w:tblGrid>
       <w:tr>
         <w:trPr>
@@ -2402,7 +2218,7 @@
         </w:trPr>
         <w:tc>
           <w:tcPr>
-            <w:tcW w:w="620" w:type="pct"/>
+            <w:tcW w:w="906" w:type="pct"/>
             <w:tcMar>
               <w:top w:w="100" w:type="dxa"/>
               <w:left w:w="100" w:type="dxa"/>
@@ -2426,13 +2242,14 @@
                 <w:sz w:val="22"/>
                 <w:szCs w:val="22"/>
               </w:rPr>
+              <w:lastRenderedPageBreak/>
               <w:t>Mục tiêu (MT)</w:t>
             </w:r>
           </w:p>
         </w:tc>
         <w:tc>
           <w:tcPr>
-            <w:tcW w:w="3637" w:type="pct"/>
+            <w:tcW w:w="3494" w:type="pct"/>
             <w:tcMar>
               <w:top w:w="100" w:type="dxa"/>
               <w:left w:w="100" w:type="dxa"/>
@@ -2471,7 +2288,7 @@
         </w:tc>
         <w:tc>
           <w:tcPr>
-            <w:tcW w:w="743" w:type="pct"/>
+            <w:tcW w:w="600" w:type="pct"/>
             <w:tcMar>
               <w:top w:w="100" w:type="dxa"/>
               <w:left w:w="100" w:type="dxa"/>
@@ -2535,34 +2352,40 @@
         </w:trPr>
         <w:tc>
           <w:tcPr>
-            <w:tcW w:w="620" w:type="pct"/>
+            <w:tcW w:w="906" w:type="pct"/>
             <w:tcMar>
               <w:top w:w="100" w:type="dxa"/>
               <w:left w:w="100" w:type="dxa"/>
               <w:bottom w:w="100" w:type="dxa"/>
               <w:right w:w="100" w:type="dxa"/>
             </w:tcMar>
-            <w:vAlign w:val="center"/>
-          </w:tcPr>
-          <w:p>
-            <w:pPr>
-              <w:jc w:val="center"/>
-            </w:pPr>
-            <w:r>
-              <w:t>MT1</w:t>
-            </w:r>
-          </w:p>
-        </w:tc>
-        <w:tc>
-          <w:tcPr>
-            <w:tcW w:w="3637" w:type="pct"/>
+            <w:vAlign w:val="bottom"/>
+          </w:tcPr>
+          <w:p>
+            <w:pPr>
+              <w:jc w:val="center"/>
+            </w:pPr>
+            <w:r>
+              <w:rPr>
+                <w:rFonts w:ascii="Arial" w:hAnsi="Arial" w:cs="Arial"/>
+                <w:color w:val="000000"/>
+                <w:sz w:val="22"/>
+                <w:szCs w:val="22"/>
+              </w:rPr>
+              <w:t>{{#Objectives}}</w:t>
+            </w:r>
+          </w:p>
+        </w:tc>
+        <w:tc>
+          <w:tcPr>
+            <w:tcW w:w="3494" w:type="pct"/>
             <w:tcMar>
               <w:top w:w="100" w:type="dxa"/>
               <w:left w:w="100" w:type="dxa"/>
               <w:bottom w:w="100" w:type="dxa"/>
               <w:right w:w="100" w:type="dxa"/>
             </w:tcMar>
-            <w:vAlign w:val="center"/>
+            <w:vAlign w:val="bottom"/>
           </w:tcPr>
           <w:p/>
         </w:tc>
@@ -2575,15 +2398,12 @@
               <w:bottom w:w="100" w:type="dxa"/>
               <w:right w:w="100" w:type="dxa"/>
             </w:tcMar>
-            <w:vAlign w:val="center"/>
-          </w:tcPr>
-          <w:p>
-            <w:pPr>
-              <w:jc w:val="center"/>
-            </w:pPr>
-            <w:r>
-              <w:t>PLO1</w:t>
-            </w:r>
+            <w:vAlign w:val="bottom"/>
+          </w:tcPr>
+          <w:p>
+            <w:pPr>
+              <w:jc w:val="center"/>
+            </w:pPr>
           </w:p>
         </w:tc>
       </w:tr>
@@ -2593,36 +2413,50 @@
         </w:trPr>
         <w:tc>
           <w:tcPr>
-            <w:tcW w:w="620" w:type="pct"/>
+            <w:tcW w:w="906" w:type="pct"/>
             <w:tcMar>
               <w:top w:w="100" w:type="dxa"/>
               <w:left w:w="100" w:type="dxa"/>
               <w:bottom w:w="100" w:type="dxa"/>
               <w:right w:w="100" w:type="dxa"/>
             </w:tcMar>
-            <w:vAlign w:val="center"/>
-          </w:tcPr>
-          <w:p>
-            <w:pPr>
-              <w:jc w:val="center"/>
-            </w:pPr>
-            <w:r>
-              <w:t>MT2</w:t>
-            </w:r>
-          </w:p>
-        </w:tc>
-        <w:tc>
-          <w:tcPr>
-            <w:tcW w:w="3637" w:type="pct"/>
+          </w:tcPr>
+          <w:p>
+            <w:pPr>
+              <w:jc w:val="center"/>
+            </w:pPr>
+            <w:r>
+              <w:rPr>
+                <w:rFonts w:ascii="Arial" w:hAnsi="Arial" w:cs="Arial"/>
+                <w:color w:val="000000"/>
+                <w:sz w:val="22"/>
+                <w:szCs w:val="22"/>
+              </w:rPr>
+              <w:t>{{ No }}</w:t>
+            </w:r>
+          </w:p>
+        </w:tc>
+        <w:tc>
+          <w:tcPr>
+            <w:tcW w:w="3494" w:type="pct"/>
             <w:tcMar>
               <w:top w:w="100" w:type="dxa"/>
               <w:left w:w="100" w:type="dxa"/>
               <w:bottom w:w="100" w:type="dxa"/>
               <w:right w:w="100" w:type="dxa"/>
             </w:tcMar>
-            <w:vAlign w:val="center"/>
-          </w:tcPr>
-          <w:p/>
+          </w:tcPr>
+          <w:p>
+            <w:r>
+              <w:rPr>
+                <w:rFonts w:ascii="Arial" w:hAnsi="Arial" w:cs="Arial"/>
+                <w:color w:val="000000"/>
+                <w:sz w:val="22"/>
+                <w:szCs w:val="22"/>
+              </w:rPr>
+              <w:t>{{ Description }}</w:t>
+            </w:r>
+          </w:p>
         </w:tc>
         <w:tc>
           <w:tcPr>
@@ -2633,14 +2467,19 @@
               <w:bottom w:w="100" w:type="dxa"/>
               <w:right w:w="100" w:type="dxa"/>
             </w:tcMar>
-            <w:vAlign w:val="center"/>
-          </w:tcPr>
-          <w:p>
-            <w:pPr>
-              <w:jc w:val="center"/>
-            </w:pPr>
-            <w:r>
-              <w:t>PLO2</w:t>
+          </w:tcPr>
+          <w:p>
+            <w:pPr>
+              <w:jc w:val="center"/>
+            </w:pPr>
+            <w:r>
+              <w:rPr>
+                <w:rFonts w:ascii="Arial" w:hAnsi="Arial" w:cs="Arial"/>
+                <w:color w:val="000000"/>
+                <w:sz w:val="22"/>
+                <w:szCs w:val="22"/>
+              </w:rPr>
+              <w:t>{{ PLO }}</w:t>
             </w:r>
           </w:p>
         </w:tc>
@@ -2651,34 +2490,40 @@
         </w:trPr>
         <w:tc>
           <w:tcPr>
-            <w:tcW w:w="620" w:type="pct"/>
+            <w:tcW w:w="906" w:type="pct"/>
             <w:tcMar>
               <w:top w:w="100" w:type="dxa"/>
               <w:left w:w="100" w:type="dxa"/>
               <w:bottom w:w="100" w:type="dxa"/>
               <w:right w:w="100" w:type="dxa"/>
             </w:tcMar>
-            <w:vAlign w:val="center"/>
-          </w:tcPr>
-          <w:p>
-            <w:pPr>
-              <w:jc w:val="center"/>
-            </w:pPr>
-            <w:r>
-              <w:t>MT3</w:t>
-            </w:r>
-          </w:p>
-        </w:tc>
-        <w:tc>
-          <w:tcPr>
-            <w:tcW w:w="3637" w:type="pct"/>
+            <w:vAlign w:val="bottom"/>
+          </w:tcPr>
+          <w:p>
+            <w:pPr>
+              <w:jc w:val="center"/>
+            </w:pPr>
+            <w:r>
+              <w:rPr>
+                <w:rFonts w:ascii="Arial" w:hAnsi="Arial" w:cs="Arial"/>
+                <w:color w:val="000000"/>
+                <w:sz w:val="22"/>
+                <w:szCs w:val="22"/>
+              </w:rPr>
+              <w:t>{{/Objectives}}</w:t>
+            </w:r>
+          </w:p>
+        </w:tc>
+        <w:tc>
+          <w:tcPr>
+            <w:tcW w:w="3494" w:type="pct"/>
             <w:tcMar>
               <w:top w:w="100" w:type="dxa"/>
               <w:left w:w="100" w:type="dxa"/>
               <w:bottom w:w="100" w:type="dxa"/>
               <w:right w:w="100" w:type="dxa"/>
             </w:tcMar>
-            <w:vAlign w:val="center"/>
+            <w:vAlign w:val="bottom"/>
           </w:tcPr>
           <w:p/>
         </w:tc>
@@ -2691,73 +2536,12 @@
               <w:bottom w:w="100" w:type="dxa"/>
               <w:right w:w="100" w:type="dxa"/>
             </w:tcMar>
-            <w:vAlign w:val="center"/>
-          </w:tcPr>
-          <w:p>
-            <w:pPr>
-              <w:jc w:val="center"/>
-            </w:pPr>
-            <w:r>
-              <w:t>PLO3</w:t>
-            </w:r>
-          </w:p>
-        </w:tc>
-      </w:tr>
-      <w:tr>
-        <w:trPr>
-          <w:jc w:val="center"/>
-        </w:trPr>
-        <w:tc>
-          <w:tcPr>
-            <w:tcW w:w="620" w:type="pct"/>
-            <w:tcMar>
-              <w:top w:w="100" w:type="dxa"/>
-              <w:left w:w="100" w:type="dxa"/>
-              <w:bottom w:w="100" w:type="dxa"/>
-              <w:right w:w="100" w:type="dxa"/>
-            </w:tcMar>
-            <w:vAlign w:val="center"/>
-          </w:tcPr>
-          <w:p>
-            <w:pPr>
-              <w:jc w:val="center"/>
-            </w:pPr>
-            <w:r>
-              <w:t>MT4</w:t>
-            </w:r>
-          </w:p>
-        </w:tc>
-        <w:tc>
-          <w:tcPr>
-            <w:tcW w:w="3637" w:type="pct"/>
-            <w:tcMar>
-              <w:top w:w="100" w:type="dxa"/>
-              <w:left w:w="100" w:type="dxa"/>
-              <w:bottom w:w="100" w:type="dxa"/>
-              <w:right w:w="100" w:type="dxa"/>
-            </w:tcMar>
-            <w:vAlign w:val="center"/>
-          </w:tcPr>
-          <w:p/>
-        </w:tc>
-        <w:tc>
-          <w:tcPr>
-            <w:tcW w:w="0" w:type="auto"/>
-            <w:tcMar>
-              <w:top w:w="100" w:type="dxa"/>
-              <w:left w:w="100" w:type="dxa"/>
-              <w:bottom w:w="100" w:type="dxa"/>
-              <w:right w:w="100" w:type="dxa"/>
-            </w:tcMar>
-            <w:vAlign w:val="center"/>
-          </w:tcPr>
-          <w:p>
-            <w:pPr>
-              <w:jc w:val="center"/>
-            </w:pPr>
-            <w:r>
-              <w:t>PLO4</w:t>
-            </w:r>
+            <w:vAlign w:val="bottom"/>
+          </w:tcPr>
+          <w:p>
+            <w:pPr>
+              <w:jc w:val="center"/>
+            </w:pPr>
           </w:p>
         </w:tc>
       </w:tr>
@@ -2889,10 +2673,10 @@
         <w:tblLook w:val="0000" w:firstRow="0" w:lastRow="0" w:firstColumn="0" w:lastColumn="0" w:noHBand="0" w:noVBand="0"/>
       </w:tblPr>
       <w:tblGrid>
-        <w:gridCol w:w="997"/>
-        <w:gridCol w:w="6227"/>
-        <w:gridCol w:w="774"/>
-        <w:gridCol w:w="1076"/>
+        <w:gridCol w:w="1179"/>
+        <w:gridCol w:w="6167"/>
+        <w:gridCol w:w="757"/>
+        <w:gridCol w:w="971"/>
       </w:tblGrid>
       <w:tr>
         <w:trPr>
@@ -2900,7 +2684,7 @@
         </w:trPr>
         <w:tc>
           <w:tcPr>
-            <w:tcW w:w="550" w:type="pct"/>
+            <w:tcW w:w="650" w:type="pct"/>
             <w:tcMar>
               <w:top w:w="100" w:type="dxa"/>
               <w:left w:w="100" w:type="dxa"/>
@@ -2930,7 +2714,7 @@
         </w:tc>
         <w:tc>
           <w:tcPr>
-            <w:tcW w:w="3431" w:type="pct"/>
+            <w:tcW w:w="3398" w:type="pct"/>
             <w:tcMar>
               <w:top w:w="100" w:type="dxa"/>
               <w:left w:w="100" w:type="dxa"/>
@@ -2960,7 +2744,7 @@
         </w:tc>
         <w:tc>
           <w:tcPr>
-            <w:tcW w:w="426" w:type="pct"/>
+            <w:tcW w:w="417" w:type="pct"/>
             <w:tcMar>
               <w:top w:w="100" w:type="dxa"/>
               <w:left w:w="100" w:type="dxa"/>
@@ -3010,7 +2794,7 @@
         </w:tc>
         <w:tc>
           <w:tcPr>
-            <w:tcW w:w="593" w:type="pct"/>
+            <w:tcW w:w="536" w:type="pct"/>
             <w:tcMar>
               <w:top w:w="100" w:type="dxa"/>
               <w:left w:w="100" w:type="dxa"/>
@@ -3045,75 +2829,75 @@
         </w:trPr>
         <w:tc>
           <w:tcPr>
-            <w:tcW w:w="550" w:type="pct"/>
+            <w:tcW w:w="650" w:type="pct"/>
             <w:tcMar>
               <w:top w:w="100" w:type="dxa"/>
               <w:left w:w="100" w:type="dxa"/>
               <w:bottom w:w="100" w:type="dxa"/>
               <w:right w:w="100" w:type="dxa"/>
             </w:tcMar>
-            <w:vAlign w:val="center"/>
-          </w:tcPr>
-          <w:p>
-            <w:pPr>
-              <w:jc w:val="center"/>
-            </w:pPr>
-            <w:r>
-              <w:t>CLO1</w:t>
-            </w:r>
-          </w:p>
-        </w:tc>
-        <w:tc>
-          <w:tcPr>
-            <w:tcW w:w="3431" w:type="pct"/>
+            <w:vAlign w:val="bottom"/>
+          </w:tcPr>
+          <w:p>
+            <w:pPr>
+              <w:jc w:val="center"/>
+            </w:pPr>
+            <w:r>
+              <w:rPr>
+                <w:rFonts w:ascii="Arial" w:hAnsi="Arial" w:cs="Arial"/>
+                <w:color w:val="000000"/>
+                <w:sz w:val="22"/>
+                <w:szCs w:val="22"/>
+              </w:rPr>
+              <w:t>{{#CLOs}}</w:t>
+            </w:r>
+          </w:p>
+        </w:tc>
+        <w:tc>
+          <w:tcPr>
+            <w:tcW w:w="3398" w:type="pct"/>
             <w:tcMar>
               <w:top w:w="100" w:type="dxa"/>
               <w:left w:w="100" w:type="dxa"/>
               <w:bottom w:w="100" w:type="dxa"/>
               <w:right w:w="100" w:type="dxa"/>
             </w:tcMar>
-            <w:vAlign w:val="center"/>
+            <w:vAlign w:val="bottom"/>
           </w:tcPr>
           <w:p/>
         </w:tc>
         <w:tc>
           <w:tcPr>
-            <w:tcW w:w="426" w:type="pct"/>
+            <w:tcW w:w="417" w:type="pct"/>
             <w:tcMar>
               <w:top w:w="100" w:type="dxa"/>
               <w:left w:w="100" w:type="dxa"/>
               <w:bottom w:w="100" w:type="dxa"/>
               <w:right w:w="100" w:type="dxa"/>
             </w:tcMar>
-            <w:vAlign w:val="center"/>
-          </w:tcPr>
-          <w:p>
-            <w:pPr>
-              <w:jc w:val="center"/>
-            </w:pPr>
-            <w:r>
-              <w:t>PLO1</w:t>
-            </w:r>
-          </w:p>
-        </w:tc>
-        <w:tc>
-          <w:tcPr>
-            <w:tcW w:w="593" w:type="pct"/>
+            <w:vAlign w:val="bottom"/>
+          </w:tcPr>
+          <w:p>
+            <w:pPr>
+              <w:jc w:val="center"/>
+            </w:pPr>
+          </w:p>
+        </w:tc>
+        <w:tc>
+          <w:tcPr>
+            <w:tcW w:w="536" w:type="pct"/>
             <w:tcMar>
               <w:top w:w="100" w:type="dxa"/>
               <w:left w:w="100" w:type="dxa"/>
               <w:bottom w:w="100" w:type="dxa"/>
               <w:right w:w="100" w:type="dxa"/>
             </w:tcMar>
-            <w:vAlign w:val="center"/>
-          </w:tcPr>
-          <w:p>
-            <w:pPr>
-              <w:jc w:val="center"/>
-            </w:pPr>
-            <w:r>
-              <w:t>I</w:t>
-            </w:r>
+            <w:vAlign w:val="bottom"/>
+          </w:tcPr>
+          <w:p>
+            <w:pPr>
+              <w:jc w:val="center"/>
+            </w:pPr>
           </w:p>
         </w:tc>
       </w:tr>
@@ -3123,74 +2907,98 @@
         </w:trPr>
         <w:tc>
           <w:tcPr>
-            <w:tcW w:w="550" w:type="pct"/>
+            <w:tcW w:w="650" w:type="pct"/>
             <w:tcMar>
               <w:top w:w="100" w:type="dxa"/>
               <w:left w:w="100" w:type="dxa"/>
               <w:bottom w:w="100" w:type="dxa"/>
               <w:right w:w="100" w:type="dxa"/>
             </w:tcMar>
-            <w:vAlign w:val="center"/>
-          </w:tcPr>
-          <w:p>
-            <w:pPr>
-              <w:jc w:val="center"/>
-            </w:pPr>
-            <w:r>
-              <w:t>CLO2</w:t>
-            </w:r>
-          </w:p>
-        </w:tc>
-        <w:tc>
-          <w:tcPr>
-            <w:tcW w:w="3431" w:type="pct"/>
+          </w:tcPr>
+          <w:p>
+            <w:pPr>
+              <w:jc w:val="center"/>
+            </w:pPr>
+            <w:r>
+              <w:rPr>
+                <w:rFonts w:ascii="Arial" w:hAnsi="Arial" w:cs="Arial"/>
+                <w:color w:val="000000"/>
+                <w:sz w:val="22"/>
+                <w:szCs w:val="22"/>
+              </w:rPr>
+              <w:t>{{ Code }}</w:t>
+            </w:r>
+          </w:p>
+        </w:tc>
+        <w:tc>
+          <w:tcPr>
+            <w:tcW w:w="3398" w:type="pct"/>
             <w:tcMar>
               <w:top w:w="100" w:type="dxa"/>
               <w:left w:w="100" w:type="dxa"/>
               <w:bottom w:w="100" w:type="dxa"/>
               <w:right w:w="100" w:type="dxa"/>
             </w:tcMar>
-            <w:vAlign w:val="center"/>
-          </w:tcPr>
-          <w:p/>
-        </w:tc>
-        <w:tc>
-          <w:tcPr>
-            <w:tcW w:w="426" w:type="pct"/>
+          </w:tcPr>
+          <w:p>
+            <w:r>
+              <w:rPr>
+                <w:rFonts w:ascii="Arial" w:hAnsi="Arial" w:cs="Arial"/>
+                <w:color w:val="000000"/>
+                <w:sz w:val="22"/>
+                <w:szCs w:val="22"/>
+              </w:rPr>
+              <w:t>{{ Description }}</w:t>
+            </w:r>
+          </w:p>
+        </w:tc>
+        <w:tc>
+          <w:tcPr>
+            <w:tcW w:w="417" w:type="pct"/>
             <w:tcMar>
               <w:top w:w="100" w:type="dxa"/>
               <w:left w:w="100" w:type="dxa"/>
               <w:bottom w:w="100" w:type="dxa"/>
               <w:right w:w="100" w:type="dxa"/>
             </w:tcMar>
-            <w:vAlign w:val="center"/>
-          </w:tcPr>
-          <w:p>
-            <w:pPr>
-              <w:jc w:val="center"/>
-            </w:pPr>
-            <w:r>
-              <w:t>PLO2</w:t>
-            </w:r>
-          </w:p>
-        </w:tc>
-        <w:tc>
-          <w:tcPr>
-            <w:tcW w:w="593" w:type="pct"/>
+          </w:tcPr>
+          <w:p>
+            <w:pPr>
+              <w:jc w:val="center"/>
+            </w:pPr>
+            <w:r>
+              <w:rPr>
+                <w:rFonts w:ascii="Arial" w:hAnsi="Arial" w:cs="Arial"/>
+                <w:color w:val="000000"/>
+                <w:sz w:val="22"/>
+                <w:szCs w:val="22"/>
+              </w:rPr>
+              <w:t>{{ PLO }}</w:t>
+            </w:r>
+          </w:p>
+        </w:tc>
+        <w:tc>
+          <w:tcPr>
+            <w:tcW w:w="536" w:type="pct"/>
             <w:tcMar>
               <w:top w:w="100" w:type="dxa"/>
               <w:left w:w="100" w:type="dxa"/>
               <w:bottom w:w="100" w:type="dxa"/>
               <w:right w:w="100" w:type="dxa"/>
             </w:tcMar>
-            <w:vAlign w:val="center"/>
-          </w:tcPr>
-          <w:p>
-            <w:pPr>
-              <w:jc w:val="center"/>
-            </w:pPr>
-            <w:r>
-              <w:t>R</w:t>
+          </w:tcPr>
+          <w:p>
+            <w:pPr>
+              <w:jc w:val="center"/>
+            </w:pPr>
+            <w:r>
+              <w:rPr>
+                <w:rFonts w:ascii="Arial" w:hAnsi="Arial" w:cs="Arial"/>
+                <w:color w:val="000000"/>
+                <w:sz w:val="22"/>
+                <w:szCs w:val="22"/>
+              </w:rPr>
+              <w:t>{{ Level }}</w:t>
             </w:r>
           </w:p>
         </w:tc>
@@ -3201,153 +3009,75 @@
         </w:trPr>
         <w:tc>
           <w:tcPr>
-            <w:tcW w:w="550" w:type="pct"/>
+            <w:tcW w:w="650" w:type="pct"/>
             <w:tcMar>
               <w:top w:w="100" w:type="dxa"/>
               <w:left w:w="100" w:type="dxa"/>
               <w:bottom w:w="100" w:type="dxa"/>
               <w:right w:w="100" w:type="dxa"/>
             </w:tcMar>
-            <w:vAlign w:val="center"/>
-          </w:tcPr>
-          <w:p>
-            <w:pPr>
-              <w:jc w:val="center"/>
-            </w:pPr>
-            <w:r>
-              <w:t>CLO3</w:t>
-            </w:r>
-          </w:p>
-        </w:tc>
-        <w:tc>
-          <w:tcPr>
-            <w:tcW w:w="3431" w:type="pct"/>
+            <w:vAlign w:val="bottom"/>
+          </w:tcPr>
+          <w:p>
+            <w:pPr>
+              <w:jc w:val="center"/>
+            </w:pPr>
+            <w:r>
+              <w:rPr>
+                <w:rFonts w:ascii="Arial" w:hAnsi="Arial" w:cs="Arial"/>
+                <w:color w:val="000000"/>
+                <w:sz w:val="22"/>
+                <w:szCs w:val="22"/>
+              </w:rPr>
+              <w:t>{{/CLOs}}</w:t>
+            </w:r>
+          </w:p>
+        </w:tc>
+        <w:tc>
+          <w:tcPr>
+            <w:tcW w:w="3398" w:type="pct"/>
             <w:tcMar>
               <w:top w:w="100" w:type="dxa"/>
               <w:left w:w="100" w:type="dxa"/>
               <w:bottom w:w="100" w:type="dxa"/>
               <w:right w:w="100" w:type="dxa"/>
             </w:tcMar>
-            <w:vAlign w:val="center"/>
+            <w:vAlign w:val="bottom"/>
           </w:tcPr>
           <w:p/>
         </w:tc>
         <w:tc>
           <w:tcPr>
-            <w:tcW w:w="426" w:type="pct"/>
+            <w:tcW w:w="417" w:type="pct"/>
             <w:tcMar>
               <w:top w:w="100" w:type="dxa"/>
               <w:left w:w="100" w:type="dxa"/>
               <w:bottom w:w="100" w:type="dxa"/>
               <w:right w:w="100" w:type="dxa"/>
             </w:tcMar>
-            <w:vAlign w:val="center"/>
-          </w:tcPr>
-          <w:p>
-            <w:pPr>
-              <w:jc w:val="center"/>
-            </w:pPr>
-            <w:r>
-              <w:t>PLO3</w:t>
-            </w:r>
-          </w:p>
-        </w:tc>
-        <w:tc>
-          <w:tcPr>
-            <w:tcW w:w="593" w:type="pct"/>
+            <w:vAlign w:val="bottom"/>
+          </w:tcPr>
+          <w:p>
+            <w:pPr>
+              <w:jc w:val="center"/>
+            </w:pPr>
+          </w:p>
+        </w:tc>
+        <w:tc>
+          <w:tcPr>
+            <w:tcW w:w="536" w:type="pct"/>
             <w:tcMar>
               <w:top w:w="100" w:type="dxa"/>
               <w:left w:w="100" w:type="dxa"/>
               <w:bottom w:w="100" w:type="dxa"/>
               <w:right w:w="100" w:type="dxa"/>
             </w:tcMar>
-            <w:vAlign w:val="center"/>
-          </w:tcPr>
-          <w:p>
-            <w:pPr>
-              <w:jc w:val="center"/>
-            </w:pPr>
-            <w:r>
-              <w:t>R</w:t>
-            </w:r>
-          </w:p>
-        </w:tc>
-      </w:tr>
-      <w:tr>
-        <w:trPr>
-          <w:trHeight w:val="57"/>
-        </w:trPr>
-        <w:tc>
-          <w:tcPr>
-            <w:tcW w:w="550" w:type="pct"/>
-            <w:tcMar>
-              <w:top w:w="100" w:type="dxa"/>
-              <w:left w:w="100" w:type="dxa"/>
-              <w:bottom w:w="100" w:type="dxa"/>
-              <w:right w:w="100" w:type="dxa"/>
-            </w:tcMar>
-            <w:vAlign w:val="center"/>
-          </w:tcPr>
-          <w:p>
-            <w:pPr>
-              <w:jc w:val="center"/>
-            </w:pPr>
-            <w:r>
-              <w:t>CLO4</w:t>
-            </w:r>
-          </w:p>
-        </w:tc>
-        <w:tc>
-          <w:tcPr>
-            <w:tcW w:w="3431" w:type="pct"/>
-            <w:tcMar>
-              <w:top w:w="100" w:type="dxa"/>
-              <w:left w:w="100" w:type="dxa"/>
-              <w:bottom w:w="100" w:type="dxa"/>
-              <w:right w:w="100" w:type="dxa"/>
-            </w:tcMar>
-            <w:vAlign w:val="center"/>
-          </w:tcPr>
-          <w:p/>
-        </w:tc>
-        <w:tc>
-          <w:tcPr>
-            <w:tcW w:w="426" w:type="pct"/>
-            <w:tcMar>
-              <w:top w:w="100" w:type="dxa"/>
-              <w:left w:w="100" w:type="dxa"/>
-              <w:bottom w:w="100" w:type="dxa"/>
-              <w:right w:w="100" w:type="dxa"/>
-            </w:tcMar>
-            <w:vAlign w:val="center"/>
-          </w:tcPr>
-          <w:p>
-            <w:pPr>
-              <w:jc w:val="center"/>
-            </w:pPr>
-            <w:r>
-              <w:t>PLO4</w:t>
-            </w:r>
-          </w:p>
-        </w:tc>
-        <w:tc>
-          <w:tcPr>
-            <w:tcW w:w="593" w:type="pct"/>
-            <w:tcMar>
-              <w:top w:w="100" w:type="dxa"/>
-              <w:left w:w="100" w:type="dxa"/>
-              <w:bottom w:w="100" w:type="dxa"/>
-              <w:right w:w="100" w:type="dxa"/>
-            </w:tcMar>
-            <w:vAlign w:val="center"/>
-          </w:tcPr>
-          <w:p>
-            <w:pPr>
-              <w:jc w:val="center"/>
-            </w:pPr>
-            <w:r>
-              <w:t>M</w:t>
-            </w:r>
+            <w:vAlign w:val="bottom"/>
+          </w:tcPr>
+          <w:p>
+            <w:pPr>
+              <w:jc w:val="center"/>
+            </w:pPr>
           </w:p>
         </w:tc>
       </w:tr>
@@ -3470,7 +3200,6 @@
           <w:b/>
           <w:lang w:val="fr-FR"/>
         </w:rPr>
-        <w:lastRenderedPageBreak/>
         <w:t>5.1. Tài liệu h</w:t>
       </w:r>
       <w:r>
@@ -3787,6 +3516,7 @@
           <w:i/>
           <w:iCs/>
         </w:rPr>
+        <w:lastRenderedPageBreak/>
         <w:t>Danh mục 10 bài báo quốc tế uy tín trong 05 năm gần nhất liên quan đến học phần; Học liệu kế thừa: Các đề tài, dự án nghiên cứu của Trường Đại học Điện lực; Không gian nghiên cứu: NCS thực hiện sinh hoạt khoa học tại phòng Lab chuyên dụng của Khoa, truy cập CSDL ScienceDirect/IEEE</w:t>
       </w:r>
     </w:p>
@@ -4834,7 +4564,6 @@
               <w:spacing w:before="0" w:beforeAutospacing="0" w:after="0" w:afterAutospacing="0"/>
             </w:pPr>
             <w:r>
-              <w:lastRenderedPageBreak/>
               <w:t>- Chuẩn bị bài thuyết trình nhóm 1</w:t>
             </w:r>
           </w:p>
@@ -4861,7 +4590,6 @@
               </w:rPr>
             </w:pPr>
             <w:r>
-              <w:lastRenderedPageBreak/>
               <w:t>CLO1</w:t>
             </w:r>
           </w:p>
@@ -5036,6 +4764,7 @@
               <w:rPr>
                 <w:b/>
               </w:rPr>
+              <w:lastRenderedPageBreak/>
               <w:t>TT</w:t>
             </w:r>
           </w:p>
@@ -11596,19 +11325,19 @@
       </w:rPr>
     </w:lvl>
   </w:abstractNum>
-  <w:num w:numId="1" w16cid:durableId="1109281147">
+  <w:num w:numId="1" w16cid:durableId="473256720">
     <w:abstractNumId w:val="1"/>
   </w:num>
-  <w:num w:numId="2" w16cid:durableId="1415858935">
+  <w:num w:numId="2" w16cid:durableId="1328440744">
     <w:abstractNumId w:val="3"/>
   </w:num>
-  <w:num w:numId="3" w16cid:durableId="749355384">
+  <w:num w:numId="3" w16cid:durableId="1601792097">
     <w:abstractNumId w:val="0"/>
   </w:num>
-  <w:num w:numId="4" w16cid:durableId="362095558">
+  <w:num w:numId="4" w16cid:durableId="679547223">
     <w:abstractNumId w:val="2"/>
   </w:num>
-  <w:num w:numId="5" w16cid:durableId="797340921">
+  <w:num w:numId="5" w16cid:durableId="799998434">
     <w:abstractNumId w:val="4"/>
   </w:num>
 </w:numbering>

</xml_diff>